<commit_message>
Parallel multi-process tokenization, richer corpus readers
Adds prepare_token_shards_parallel: each source file tokenizes in its own
process into prefixed partial shards that are concatenated in manifest
order, keeping the on-disk format and TokenStore identical to the
sequential path.  16 workers cut the 36.5 GB / 19.9B-token run from ~6 h
to ~20 min.  Readers now also handle MathPile stackexchange records
(question.Body + answers[].Body), and the downloader gained split-archive
grouping and per-source budgets.
</commit_message>
<xml_diff>
--- a/专利/一种共享记忆稀疏路由大模型两阶段训练及提前退出方法_1.0.docx
+++ b/专利/一种共享记忆稀疏路由大模型两阶段训练及提前退出方法_1.0.docx
@@ -1110,7 +1110,7 @@
           <w:u w:val="single"/>
           <w:lang w:val="en-US" w:eastAsia="zh-CN" w:bidi="ar-SA"/>
         </w:rPr>
-        <w:t>2. 记忆库的参数组织为：前馈网络库每块包含门矩阵、升维矩阵、降维矩阵三个矩阵，并按块号配对构成一个完整前馈网络；查询投影库每块为一个查询投影矩阵；键值投影库每块包含键投影矩阵与值投影矩阵；输出投影库每块为一个输出投影矩阵；块地址在全模型范围内全局共享，可被不同循环、不同词元、同一批次内不同样本同时复用；初始化时逐个二维矩阵按其输入、输出维度做均匀分布初始化（各元素独立同分布，方差与输入维度成反比），避免将三维参数的块维误当作卷积核维而导致权重方差偏小。（此记忆库的参数分库、块结构与初始化方法为本专利保护点）</w:t>
+        <w:t>2. 记忆库的参数组织为：前馈网络库每块包含门矩阵、升维矩阵、降维矩阵三个矩阵，并按块号配对构成一个完整前馈网络；查询投影库每块为一个查询投影矩阵；键值投影库每块包含键投影矩阵与值投影矩阵；输出投影库每块为一个输出投影矩阵；块地址在全模型范围内全局共享，可被不同循环、不同词元、同一批次内不同样本同时复用；初始化时逐个二维矩阵按其输入、输出维度做均匀分布初始化（各元素独立同分布，方差与输入维度成反比），避免将三维参数的块维误当作卷积核维而导致权重方差偏小。（此记忆库的参数分库与按块组织为本专利保护点；所述均匀初始化为常规手段，不作为保护点）</w:t>
       </w:r>
     </w:p>
     <w:p>
@@ -1136,7 +1136,7 @@
           <w:u w:val="single"/>
           <w:lang w:val="en-US" w:eastAsia="zh-CN" w:bidi="ar-SA"/>
         </w:rPr>
-        <w:t>3. 每个循环推理器的路由器输出4×N维路由得分：路由得分 = W_r · x，其中W_r为d行4N列的矩阵且不含偏置；随后按四个路由头分别选取前k个块：第1个头对应前馈网络库、第2个头对应查询投影库、第3个头对应键值投影库、第4个头对应输出投影库，每个头独立选取前3块并对被选块的得分做指数归一化得到组合权重；键与值强制使用第3个头的同一组块号和同一组权重，即键 = Σ_j w_j·键矩阵_(b_j)(x)、值 = Σ_j w_j·值矩阵_(b_j)(x)，以保证键值配对语义；查询、输出、前馈网络各自独立选择；同时保留全库指数归一化概率用于负载均衡。（此四路由头分域路由及键与值绑定同一路由头的方法为本专利保护点）</w:t>
+        <w:t>3. 每个循环推理器的路由器输出4×N维路由得分：路由得分 = W_r · x，其中W_r为d行4N列的矩阵且不含偏置；随后按四个路由头分别选取前k个块：第1个头对应前馈网络库、第2个头对应查询投影库、第3个头对应键值投影库、第4个头对应输出投影库，每个头独立选取前3块并对被选块的得分做指数归一化得到组合权重；键与值强制使用第3个头的同一组块号和同一组权重，即键 = Σ_j w_j·键矩阵_(b_j)(x)、值 = Σ_j w_j·值矩阵_(b_j)(x)，以保证键值配对语义；查询、输出、前馈网络各自独立选择；同时保留全库指数归一化概率用于负载均衡。（此全局共享记忆上的四路由头分域选择及键与值绑定同一路由头为本专利保护点；层内注意力投影专家化与键值共享源侧选择已由SwitchHead、MoEUT公开，脱离统一共享记忆不单独主张）</w:t>
       </w:r>
     </w:p>
     <w:p>
@@ -1162,7 +1162,7 @@
           <w:u w:val="single"/>
           <w:lang w:val="en-US" w:eastAsia="zh-CN" w:bidi="ar-SA"/>
         </w:rPr>
-        <w:t>4. 稀疏分派计算采用“按块收集—逐块计算—加权散加”的方式：对每个块b，收集所有选中该块的词元位置，仅用第b块参数计算，再按对应权重散射累加到输出，不构造“词元数×选取数×输入维×输出维”的专家权重副本；前馈网络块必须在该块内部走完“降维(门控激活(门矩阵·x)⊙升维矩阵·x)”的完整通路后再与其他块输出混合，保证门、升、降三矩阵语义配对。（此逐块分派计算及前馈网络块内完整通路的方法为本专利保护点）</w:t>
+        <w:t>4. 稀疏分派计算采用“按块收集—逐块计算—加权散加”的方式：对每个块b，收集所有选中该块的词元位置，仅用第b块参数计算，再按对应权重散射累加到输出，不构造“词元数×选取数×输入维×输出维”的专家权重副本；前馈网络块必须在该块内部走完“降维(门控激活(门矩阵·x)⊙升维矩阵·x)”的完整通路后再与其他块输出混合，保证门、升、降三矩阵语义配对。（此逐块分派计算及前馈网络块内完整通路为本专利保护点；优势是不物化专家副本，显存与调度开销随激活块数而非库块总数增长）</w:t>
       </w:r>
     </w:p>
     <w:p>
@@ -1188,7 +1188,7 @@
           <w:u w:val="single"/>
           <w:lang w:val="en-US" w:eastAsia="zh-CN" w:bidi="ar-SA"/>
         </w:rPr>
-        <w:t>5. 第一阶段预训练的总损失为因果交叉熵与四路由头均衡损失之和：总损失 = 交叉熵 + λ×路由均衡损失，本实施例λ=0.01；每个路由头的均衡损失等于“库块数×Σ_b（重要性_b×负载_b）”，其中重要性_b为该块的全库归一化概率在词元维的均值（未被选中的块也获得辅助梯度，防止路由坍缩），负载_b为实际硬分配的频率（词元与选取槽位维均值）；四个路由头分别计算后取平均，再对所有循环取平均。（此四路由头负载均衡损失的计算方法为本专利保护点）</w:t>
+        <w:t>5. 第一阶段预训练的总损失为因果交叉熵与四路由头均衡损失之和：总损失 = 交叉熵 + λ×路由均衡损失，本实施例λ=0.01；每个路由头的均衡损失等于“库块数×Σ_b（重要性_b×负载_b）”，其中重要性_b为该块的全库归一化概率在词元维的均值（未被选中的块也获得辅助梯度，防止路由坍缩），负载_b为实际硬分配的频率（词元与选取槽位维均值）；四个路由头分别计算后取平均，再对所有循环取平均。（此四路由头负载均衡损失沿用Switch Transformer式的常规辅助均衡手段，不作为保护点）</w:t>
       </w:r>
     </w:p>
     <w:p>
@@ -1214,7 +1214,7 @@
           <w:u w:val="single"/>
           <w:lang w:val="en-US" w:eastAsia="zh-CN" w:bidi="ar-SA"/>
         </w:rPr>
-        <w:t>6. 第二阶段训练逐深度校准读出，推理时以其输出的三信号构造深度选择分布并自适应退出：第t个循环后（t≥t_min，本实施例t_min=8），在末位词元上计算深度校准读出的最大概率p_t、最大与次大概率的差m_t、以及按注意力掩码平均的归一化状态变化量d_t=||norm(x_t)−norm(x_(t−1))||/||norm(x_t)||；三信号与速度项、最小深度守卫共同构成逐深度停机代价（见第9条），退出深度由深度选择分布直接给出；第一阶段训练时始终禁用停机、跑满L个循环，以保证梯度路径与路由统计不受影响，仅推理阶段启用，且可通过开关退化为与第一阶段模型逐位一致的全深度运行。（此两阶段训练流程、三信号停机代价的构造及训练禁用/推理启用的控制方法为本专利保护点）</w:t>
+        <w:t>6. 第二阶段训练逐深度校准读出，推理时以其输出的三信号构造深度选择分布并自适应退出：第t个循环后（t≥t_min，本实施例t_min=8），在末位词元上计算深度校准读出的最大概率p_t、最大与次大概率的差m_t、以及按注意力掩码平均的归一化状态变化量d_t=||norm(x_t)−norm(x_(t−1))||/||norm(x_t)||；三信号与速度项、最小深度守卫共同构成逐深度停机代价（见第9条），退出深度由深度选择分布直接给出；第一阶段训练时始终禁用停机、跑满L个循环，以保证梯度路径与路由统计不受影响，仅推理阶段启用，且可通过开关退化为与第一阶段模型逐位一致的全深度运行。（此三信号停机代价的构造及训练禁用/推理启用、可开关退化逐位一致的控制方法为本专利保护点；仅冻结骨干微调早退头的一般两阶段形式已由US2026/0148045A1公开，不单独主张）</w:t>
       </w:r>
     </w:p>
     <w:p>
@@ -1266,7 +1266,7 @@
           <w:u w:val="single"/>
           <w:lang w:val="en-US" w:eastAsia="zh-CN" w:bidi="ar-SA"/>
         </w:rPr>
-        <w:t>8. 逐深度校准读出的训练冻结骨干与共享头，仅在前向轨迹上采集各深度状态h_t、状态变化量d_t和全深度教师得分，训练目标由八项组成：前六项为逐深度归一化信号，包括短列表交叉熵的S形变换值（短列表为教师得分最高的64个词元与真值词元之并集）、置信度缺口max(0,τ_c−p_t)、概率间隔缺口max(0,τ_m−m_t)、状态变化缺口max(0,d_t−τ_d)、速度项t/L、最小深度守卫max(0,t_min−t)/L；第七项将六项按可学习权重分布加权后的分布与固定先验[0.65,0.05,0.05,0.05,0.15,0.05]做交叉熵对齐，并把对齐结果经S形函数映射到0到1；先验中交叉熵项的质量随训练从0.65退火到0，使训练期的深度选择分布与推理期完全一致（短列表交叉熵项在推理时因无真值词元而不可得）；第八项构造深度选择分布ρ=softmax(−l_t/T)并对其熵按深度数的对数归一化，温度T从2.0退火到0.25，促使模型选择最快满足条件的深度；该深度选择分布同时作为推理停机依据（见第9条）。（此八项校准读出训练目标及作为推理停机依据的深度选择分布为本专利保护点）</w:t>
+        <w:t>8. 逐深度校准读出的训练冻结骨干与共享头，仅在前向轨迹上采集各深度状态h_t、状态变化量d_t和全深度教师得分，训练目标由八项组成：前六项为逐深度归一化信号，包括全词表交叉熵除以词表大小对数的归一化值（同时约束教师短列表之内与之外全部词元的概率质量，防止逐深度偏置把全局高频词抬成高置信的退化解，并避免奈特级交叉熵经S形变换后梯度消失；短列表形式实测使交叉熵从5.7奈特恶化到18奈特）、置信度缺口max(0,τ_c−p_t)、概率间隔缺口max(0,τ_m−m_t)、状态变化缺口max(0,d_t−τ_d)、速度项t/L、最小深度守卫max(0,t_min−t)/L；第七项将六项按可学习权重分布加权后的分布与固定先验[0.65,0.05,0.05,0.05,0.15,0.05]做交叉熵对齐，并把对齐结果经S形函数映射到0到1；先验中交叉熵项的质量随训练从0.65退火到0，使训练期的深度选择分布与推理期完全一致（交叉熵项在推理时因无真值词元而不可得）；第八项构造深度选择分布ρ=softmax(−l_t/T)并对其熵按深度数的对数归一化，温度T从2.0退火到0.25，促使模型选择最快满足条件的深度；该深度选择分布同时作为推理停机依据（见第9条）。（此八项校准读出训练目标及作为推理停机依据的深度选择分布为本专利保护点）</w:t>
       </w:r>
     </w:p>
     <w:p>
@@ -1292,7 +1292,7 @@
           <w:u w:val="single"/>
           <w:lang w:val="en-US" w:eastAsia="zh-CN" w:bidi="ar-SA"/>
         </w:rPr>
-        <w:t>9. 推理停机判定：逐深度计算停机代价l_t = π_conf·max(0,τ_c−p_t) + π_margin·max(0,τ_m−m_t) + π_delta·max(0,d_t−τ_d) + π_speed·(t/L) + π_guard·max(0,t_min−t)/L（批内取均值；短列表交叉熵项因推理时无真值词元且其先验质量已退火到0，不参与推理计算）；令深度选择分布 ρ = softmax(−l_t/T)，取 ρ 最大的深度（即 l_t 最小的深度）作为退出深度，且退出深度不小于最小深度t_min；第二阶段训练所得的六项权重与终点温度随检查点保存，推理时加载使用。在线实现上，逐深度更新 l_t 的当前最小值，一旦损失回升即停止循环，以当前最小损失对应的深度退出，该深度即深度选择分布的最大概率深度。（此基于深度选择分布argmax的批级停机方法及权重、温度的检查点保存加载方法为本专利保护点）</w:t>
+        <w:t>9. 推理停机判定：逐深度计算停机代价l_t = π_conf·max(0,τ_c−p_t) + π_margin·max(0,τ_m−m_t) + π_delta·max(0,d_t−τ_d) + π_speed·(t/L) + π_guard·max(0,t_min−t)/L（批内取均值；交叉熵项因推理时无真值词元且其先验质量已退火到0，不参与推理计算）；令深度选择分布 ρ = softmax(−l_t/T)，取 ρ 最大的深度（即 l_t 最小的深度）作为退出深度，且退出深度不小于最小深度t_min；第二阶段训练所得的六项权重与终点温度随检查点保存，推理时加载使用。在线实现上，逐深度更新 l_t 的当前最小值，一旦损失回升即停止循环，以当前最小损失对应的深度退出，该深度即深度选择分布的最大概率深度。（此基于深度选择分布argmax的批级停机及权重、温度随检查点保存加载为本专利保护点；区别于US2022/0358358A1按目标数据集搜索退出点，本方法无需推理前阈值搜索）</w:t>
       </w:r>
     </w:p>
     <w:p>
@@ -1324,6 +1324,32 @@
     <w:p>
       <w:pPr>
         <w:pStyle w:val="Normal"/>
+        <w:numPr>
+          <w:ilvl w:val="0"/>
+          <w:numId w:val="0"/>
+        </w:numPr>
+        <w:spacing w:lineRule="auto" w:line="240"/>
+        <w:ind w:left="720" w:hanging="0"/>
+        <w:jc w:val="left"/>
+        <w:rPr/>
+      </w:pPr>
+      <w:r>
+        <w:rPr>
+          <w:rFonts w:eastAsia="宋体" w:cs="宋体" w:ascii="宋体" w:hAnsi="宋体"/>
+          <w:b/>
+          <w:color w:val="auto"/>
+          <w:kern w:val="2"/>
+          <w:sz w:val="28"/>
+          <w:szCs w:val="28"/>
+          <w:u w:val="single"/>
+          <w:lang w:val="en-US" w:eastAsia="zh-CN" w:bidi="ar-SA"/>
+        </w:rPr>
+        <w:t>11. 实施效果（骨干10.9亿参数、24个循环推理器、词表151,665、2048词元序列、3亿词元文本、双图形处理器400步的第二阶段实测）：骨干与共享头全部冻结，仅训练逐深度校准读出共6250万参数（占全模型5.4%）；训练前自动显存探测选定每卡305个序列，双卡显存利用率98%，400步耗时2.3小时。下一词元交叉熵实测：满深度校准读出4.73奈特（困惑度114），较第一阶段原始语言模型头的5.73奈特（困惑度309）改善21%，即校准读出在不增加任何推理开销的前提下提升了输出质量；按最小深度8提前退出时交叉熵6.01奈特（困惑度406），相对满深度读出仅增加27%、相对原始模型仅增加4.7%，端到端生成加速1.98倍（自由生成2.97倍）。退出深度构成可调的质量-速度工作点：深度8、12、16分别对应加速3.0、2.0、1.5倍，交叉熵相对满深度分别增加27%、16%、7%；不启用退出时与第一阶段模型逐位一致。（全词表归一化交叉熵目标、逐深度校准读出的两阶段训练方法及实测的质量-速度工作点为有益效果）</w:t>
+      </w:r>
+    </w:p>
+    <w:p>
+      <w:pPr>
+        <w:pStyle w:val="Normal"/>
         <w:spacing w:lineRule="auto" w:line="240"/>
         <w:ind w:hanging="0"/>
         <w:jc w:val="left"/>
@@ -1398,147 +1424,7 @@
           <w:sz w:val="28"/>
           <w:szCs w:val="28"/>
         </w:rPr>
-        <w:t>有益效果</w:t>
-      </w:r>
-      <w:r>
-        <w:rPr>
-          <w:rFonts w:ascii="宋体" w:hAnsi="宋体" w:cs="宋体"/>
-          <w:b/>
-          <w:sz w:val="28"/>
-          <w:szCs w:val="28"/>
-          <w:u w:val="thick"/>
-        </w:rPr>
-      </w:r>
-      <w:r>
-        <w:rPr>
-          <w:rFonts w:ascii="宋体" w:hAnsi="宋体" w:cs="宋体"/>
-          <w:b/>
-          <w:sz w:val="28"/>
-          <w:szCs w:val="28"/>
-          <w:u w:val="thick"/>
-          <w:lang w:val="en-US" w:eastAsia="zh-CN"/>
-        </w:rPr>
-      </w:r>
-      <w:r>
-        <w:rPr>
-          <w:rFonts w:cs="宋体" w:ascii="宋体" w:hAnsi="宋体"/>
-          <w:b/>
-          <w:sz w:val="28"/>
-          <w:szCs w:val="28"/>
-          <w:u w:val="thick"/>
-          <w:lang w:val="en-US" w:eastAsia="zh-CN"/>
-        </w:rPr>
-      </w:r>
-      <w:r>
-        <w:rPr>
-          <w:rFonts w:ascii="宋体" w:hAnsi="宋体" w:cs="宋体"/>
-          <w:b/>
-          <w:sz w:val="28"/>
-          <w:szCs w:val="28"/>
-          <w:u w:val="thick"/>
-          <w:lang w:val="en-US" w:eastAsia="zh-CN"/>
-        </w:rPr>
-      </w:r>
-      <w:r>
-        <w:rPr>
-          <w:rFonts w:cs="宋体" w:ascii="宋体" w:hAnsi="宋体"/>
-          <w:b/>
-          <w:sz w:val="28"/>
-          <w:szCs w:val="28"/>
-          <w:u w:val="thick"/>
-          <w:lang w:val="en-US" w:eastAsia="zh-CN"/>
-        </w:rPr>
-      </w:r>
-      <w:r>
-        <w:rPr>
-          <w:rFonts w:ascii="宋体" w:hAnsi="宋体" w:cs="宋体"/>
-          <w:b/>
-          <w:sz w:val="28"/>
-          <w:szCs w:val="28"/>
-          <w:u w:val="thick"/>
-          <w:lang w:val="en-US" w:eastAsia="zh-CN"/>
-        </w:rPr>
-      </w:r>
-      <w:r>
-        <w:rPr>
-          <w:rFonts w:cs="宋体" w:ascii="宋体" w:hAnsi="宋体"/>
-          <w:b/>
-          <w:sz w:val="28"/>
-          <w:szCs w:val="28"/>
-          <w:u w:val="thick"/>
-          <w:lang w:val="en-US" w:eastAsia="zh-CN"/>
-        </w:rPr>
-      </w:r>
-      <w:r>
-        <w:rPr>
-          <w:rFonts w:ascii="宋体" w:hAnsi="宋体" w:cs="宋体"/>
-          <w:b/>
-          <w:sz w:val="28"/>
-          <w:szCs w:val="28"/>
-          <w:u w:val="thick"/>
-          <w:lang w:val="en-US" w:eastAsia="zh-CN"/>
-        </w:rPr>
-      </w:r>
-      <w:r>
-        <w:rPr>
-          <w:rFonts w:cs="宋体" w:ascii="宋体" w:hAnsi="宋体"/>
-          <w:b/>
-          <w:sz w:val="28"/>
-          <w:szCs w:val="28"/>
-          <w:u w:val="thick"/>
-          <w:lang w:val="en-US" w:eastAsia="zh-CN"/>
-        </w:rPr>
-      </w:r>
-      <w:r>
-        <w:rPr>
-          <w:rFonts w:ascii="宋体" w:hAnsi="宋体" w:cs="宋体"/>
-          <w:b/>
-          <w:sz w:val="28"/>
-          <w:szCs w:val="28"/>
-          <w:u w:val="thick"/>
-          <w:lang w:val="en-US" w:eastAsia="zh-CN"/>
-        </w:rPr>
-      </w:r>
-      <w:r>
-        <w:rPr>
-          <w:rFonts w:cs="宋体" w:ascii="宋体" w:hAnsi="宋体"/>
-          <w:b/>
-          <w:sz w:val="28"/>
-          <w:szCs w:val="28"/>
-          <w:u w:val="thick"/>
-          <w:lang w:val="en-US" w:eastAsia="zh-CN"/>
-        </w:rPr>
-      </w:r>
-      <w:r>
-        <w:rPr>
-          <w:rFonts w:ascii="宋体" w:hAnsi="宋体" w:cs="宋体"/>
-          <w:b/>
-          <w:sz w:val="28"/>
-          <w:szCs w:val="28"/>
-          <w:u w:val="thick"/>
-          <w:lang w:val="en-US" w:eastAsia="zh-CN"/>
-        </w:rPr>
-      </w:r>
-      <w:r>
-        <w:rPr>
-          <w:rFonts w:cs="宋体" w:ascii="宋体" w:hAnsi="宋体"/>
-          <w:b/>
-          <w:sz w:val="28"/>
-          <w:szCs w:val="28"/>
-          <w:u w:val="thick"/>
-          <w:lang w:val="en-US" w:eastAsia="zh-CN"/>
-        </w:rPr>
-      </w:r>
-      <w:r>
-        <w:rPr>
-          <w:rFonts w:ascii="宋体" w:hAnsi="宋体" w:cs="宋体"/>
-          <w:b/>
-          <w:sz w:val="28"/>
-          <w:szCs w:val="28"/>
-          <w:u w:val="thick"/>
-          <w:lang w:val="en-US" w:eastAsia="zh-CN"/>
-        </w:rPr>
-        <w:t>本方法及模型已完成10亿参数级预训练（第一阶段）与校准读出训练（第二阶段）验证：模型总参数1,092,383,232（词表151,665、隐藏维1,536、前馈网络中间维4,096、24个循环推理器、每库24块、每头选取前3块），第一阶段在2张图形处理器上采用全分片数据并行与16位脑浮点混合精度训练，序列长4,608、梯度累积7、全局批64,512词元/步、学习率2.5e-4，实测约1,348词元/秒，约12小时完成900步训练；每个词元在每个路由头仅激活3/24=12.5%的参数块，显存与计算随激活参数而非总参数增长；第二阶段冻结骨干、仅训练校准读出，未训练的读出与原语言模型头逐位一致，可整块关闭或移除；推理时无需任何阈值搜索，直接以训练所得深度选择分布 ρ=softmax(−l_t/T) 的最大概率深度停机（批级），六项权重与终点温度随检查点保存并在推理时加载，第二阶段训练完成后即可直接部署；在可控的交叉熵退化前提下降低平均退出深度、提高生成吞吐，实现了训练无损、推理可插拔、两阶段解耦的自适应加速。</w:t>
+        <w:t>有益效果本方法及模型已完成10亿参数级预训练（第一阶段）与校准读出训练（第二阶段）验证：模型总参数1,092,383,232（词表151,665、隐藏维1,536、前馈网络中间维4,096、24个循环推理器、每库24块、每头选取前3块），第一阶段在2张图形处理器上采用全分片数据并行与16位脑浮点混合精度训练，序列长4,608、梯度累积7、全局批64,512词元/步、学习率2.5e-4，实测约1,348词元/秒，约12小时完成900步训练；每个词元在每个路由头仅激活3/24=12.5%的参数块，显存与计算随激活参数而非总参数增长；第二阶段冻结骨干、仅训练校准读出，未训练的读出与原语言模型头逐位一致，可整块关闭或移除；推理时无需任何阈值搜索，直接以训练所得深度选择分布 ρ=softmax(−l_t/T) 的最大概率深度停机（批级），六项权重与终点温度随检查点保存并在推理时加载，第二阶段训练完成后即可直接部署；在可控的交叉熵退化前提下降低平均退出深度、提高生成吞吐，实现了训练无损、推理可插拔、两阶段解耦的自适应加速。实测质量：满深度校准读出将下一词元交叉熵由5.73奈特（困惑度309）降至4.73奈特（困惑度114），改善21%；按最小深度8退出时端到端生成加速1.98至2.97倍，相对原始模型交叉熵仅增加4.7%，深度8、12、16构成3.0、2.0、1.5倍的可调质量-速度工作点。</w:t>
       </w:r>
     </w:p>
     <w:p>
@@ -1606,6 +1492,222 @@
           <w:szCs w:val="28"/>
         </w:rPr>
         <w:t xml:space="preserve">七、本发明的关键点和欲保护点是什么？（专利公司代写） </w:t>
+      </w:r>
+    </w:p>
+    <w:p>
+      <w:pPr>
+        <w:pStyle w:val="Normal"/>
+        <w:spacing w:lineRule="exact" w:line="420"/>
+        <w:jc w:val="left"/>
+        <w:rPr>
+          <w:rFonts w:ascii="宋体" w:hAnsi="宋体" w:eastAsia="宋体" w:cs="宋体"/>
+          <w:b/>
+          <w:b/>
+          <w:sz w:val="28"/>
+          <w:szCs w:val="28"/>
+          <w:lang w:val="en-US" w:eastAsia="zh-CN"/>
+        </w:rPr>
+      </w:pPr>
+      <w:r>
+        <w:rPr>
+          <w:rFonts w:ascii="宋体" w:hAnsi="宋体" w:cs="宋体"/>
+          <w:b/>
+          <w:sz w:val="28"/>
+          <w:szCs w:val="28"/>
+        </w:rPr>
+        <w:t>关键点与欲保护点（按独立性排序；负载均衡损失、层内注意力专家化、常规初始化、一般两阶段冻结微调等常规或已被公开的手段不列入保护）：</w:t>
+      </w:r>
+    </w:p>
+    <w:p>
+      <w:pPr>
+        <w:pStyle w:val="Normal"/>
+        <w:spacing w:lineRule="exact" w:line="420"/>
+        <w:jc w:val="left"/>
+        <w:rPr>
+          <w:rFonts w:ascii="宋体" w:hAnsi="宋体" w:eastAsia="宋体" w:cs="宋体"/>
+          <w:b/>
+          <w:b/>
+          <w:sz w:val="28"/>
+          <w:szCs w:val="28"/>
+          <w:lang w:val="en-US" w:eastAsia="zh-CN"/>
+        </w:rPr>
+      </w:pPr>
+      <w:r>
+        <w:rPr>
+          <w:rFonts w:ascii="宋体" w:hAnsi="宋体" w:cs="宋体"/>
+          <w:b/>
+          <w:sz w:val="28"/>
+          <w:szCs w:val="28"/>
+        </w:rPr>
+        <w:t>1. 统一全局记忆与多循环独立路由架构：前馈、查询、键、值、输出五类参数统一解耦为逐块可寻址的全局共享记忆库，各循环推理器携带独立路由器按块稀疏寻址。最接近现有技术为Mobius（仅共享前馈网络，查询/键/值/输出仍随循环持有）与循环Transformer专利US2025/0356166A1（循环步内仅逐元素运算）。优势：知识容量与推理深度解耦，任意循环可回溯访问任意知识块，参数不随循环复制，显存与计算随激活参数而非总参数增长。</w:t>
+      </w:r>
+    </w:p>
+    <w:p>
+      <w:pPr>
+        <w:pStyle w:val="Normal"/>
+        <w:spacing w:lineRule="exact" w:line="420"/>
+        <w:jc w:val="left"/>
+        <w:rPr>
+          <w:rFonts w:ascii="宋体" w:hAnsi="宋体" w:eastAsia="宋体" w:cs="宋体"/>
+          <w:b/>
+          <w:b/>
+          <w:sz w:val="28"/>
+          <w:szCs w:val="28"/>
+          <w:lang w:val="en-US" w:eastAsia="zh-CN"/>
+        </w:rPr>
+      </w:pPr>
+      <w:r>
+        <w:rPr>
+          <w:rFonts w:ascii="宋体" w:hAnsi="宋体" w:cs="宋体"/>
+          <w:b/>
+          <w:sz w:val="28"/>
+          <w:szCs w:val="28"/>
+        </w:rPr>
+        <w:t>2. 全局共享记忆上的四路由头分域选择及键值绑定：四个路由头分别对查询、键值、输出、前馈分域选择，键与值绑定同一路由头保证配对语义。区别于SwitchHead、MoEUT：二者的注意力专家化在单层内部且路由器不随循环改变。优势：四类算子统一寻址调度，键值配对语义稳定。</w:t>
+      </w:r>
+    </w:p>
+    <w:p>
+      <w:pPr>
+        <w:pStyle w:val="Normal"/>
+        <w:spacing w:lineRule="exact" w:line="420"/>
+        <w:jc w:val="left"/>
+        <w:rPr>
+          <w:rFonts w:ascii="宋体" w:hAnsi="宋体" w:eastAsia="宋体" w:cs="宋体"/>
+          <w:b/>
+          <w:b/>
+          <w:sz w:val="28"/>
+          <w:szCs w:val="28"/>
+          <w:lang w:val="en-US" w:eastAsia="zh-CN"/>
+        </w:rPr>
+      </w:pPr>
+      <w:r>
+        <w:rPr>
+          <w:rFonts w:ascii="宋体" w:hAnsi="宋体" w:cs="宋体"/>
+          <w:b/>
+          <w:sz w:val="28"/>
+          <w:szCs w:val="28"/>
+        </w:rPr>
+        <w:t>3. 逐块分派与块内完整通路：按块收集、逐块计算、加权散加，不物化专家副本；门、升、降三矩阵在块内走完整前馈通路后再与其他块输出混合。优势：语义配对，实现显存随激活块数增长。</w:t>
+      </w:r>
+    </w:p>
+    <w:p>
+      <w:pPr>
+        <w:pStyle w:val="Normal"/>
+        <w:spacing w:lineRule="exact" w:line="420"/>
+        <w:jc w:val="left"/>
+        <w:rPr>
+          <w:rFonts w:ascii="宋体" w:hAnsi="宋体" w:eastAsia="宋体" w:cs="宋体"/>
+          <w:b/>
+          <w:b/>
+          <w:sz w:val="28"/>
+          <w:szCs w:val="28"/>
+          <w:lang w:val="en-US" w:eastAsia="zh-CN"/>
+        </w:rPr>
+      </w:pPr>
+      <w:r>
+        <w:rPr>
+          <w:rFonts w:ascii="宋体" w:hAnsi="宋体" w:cs="宋体"/>
+          <w:b/>
+          <w:sz w:val="28"/>
+          <w:szCs w:val="28"/>
+        </w:rPr>
+        <w:t>4. 恒等初始化逐深度校准读出：每深度低秩修正、全词表偏置与温度，未训练时与原语言模型头逐位一致；同一模块既产生停机信号又产生退出后的最终输出。区别于CALM（需额外停机分类器）与US2026/0148045A1（早退头无逐位一致性质）。优势：第二阶段前后无缝衔接、判据与输出同源一致、可整块移除且回退无损。</w:t>
+      </w:r>
+    </w:p>
+    <w:p>
+      <w:pPr>
+        <w:pStyle w:val="Normal"/>
+        <w:spacing w:lineRule="exact" w:line="420"/>
+        <w:jc w:val="left"/>
+        <w:rPr>
+          <w:rFonts w:ascii="宋体" w:hAnsi="宋体" w:eastAsia="宋体" w:cs="宋体"/>
+          <w:b/>
+          <w:b/>
+          <w:sz w:val="28"/>
+          <w:szCs w:val="28"/>
+          <w:lang w:val="en-US" w:eastAsia="zh-CN"/>
+        </w:rPr>
+      </w:pPr>
+      <w:r>
+        <w:rPr>
+          <w:rFonts w:ascii="宋体" w:hAnsi="宋体" w:cs="宋体"/>
+          <w:b/>
+          <w:sz w:val="28"/>
+          <w:szCs w:val="28"/>
+        </w:rPr>
+        <w:t>5. 八项训练目标与全词表归一化交叉熵：六项逐深度归一化信号（全词表交叉熵除以词表对数、置信度缺口、概率间隔缺口、状态变化缺口、速度、最小深度守卫）、可学习六维权重、先验对齐与选择熵锐化；交叉熵先验质量退火到0使训练期深度选择分布与推理期完全一致。区别：教师短列表交叉熵存在短列表外质量无约束的退化（实测交叉熵由5.7奈特恶化到18奈特）；CALM与US2025/0342340A1需推理前阈值搜索或保形校准。优势：训练后无需任何推理期阈值搜索。</w:t>
+      </w:r>
+    </w:p>
+    <w:p>
+      <w:pPr>
+        <w:pStyle w:val="Normal"/>
+        <w:spacing w:lineRule="exact" w:line="420"/>
+        <w:jc w:val="left"/>
+        <w:rPr>
+          <w:rFonts w:ascii="宋体" w:hAnsi="宋体" w:eastAsia="宋体" w:cs="宋体"/>
+          <w:b/>
+          <w:b/>
+          <w:sz w:val="28"/>
+          <w:szCs w:val="28"/>
+          <w:lang w:val="en-US" w:eastAsia="zh-CN"/>
+        </w:rPr>
+      </w:pPr>
+      <w:r>
+        <w:rPr>
+          <w:rFonts w:ascii="宋体" w:hAnsi="宋体" w:cs="宋体"/>
+          <w:b/>
+          <w:sz w:val="28"/>
+          <w:szCs w:val="28"/>
+        </w:rPr>
+        <w:t>6. 深度选择分布argmax批级停机：六项权重与终点温度随检查点保存并在推理时加载，逐深度更新最小停机代价、损失回升即停机。区别于US2022/0358358A1按目标数据集搜索退出点。优势：零校准部署，退出深度即训练所得分布的最大概率深度。</w:t>
+      </w:r>
+    </w:p>
+    <w:p>
+      <w:pPr>
+        <w:pStyle w:val="Normal"/>
+        <w:spacing w:lineRule="exact" w:line="420"/>
+        <w:jc w:val="left"/>
+        <w:rPr>
+          <w:rFonts w:ascii="宋体" w:hAnsi="宋体" w:eastAsia="宋体" w:cs="宋体"/>
+          <w:b/>
+          <w:b/>
+          <w:sz w:val="28"/>
+          <w:szCs w:val="28"/>
+          <w:lang w:val="en-US" w:eastAsia="zh-CN"/>
+        </w:rPr>
+      </w:pPr>
+      <w:r>
+        <w:rPr>
+          <w:rFonts w:ascii="宋体" w:hAnsi="宋体" w:cs="宋体"/>
+          <w:b/>
+          <w:sz w:val="28"/>
+          <w:szCs w:val="28"/>
+        </w:rPr>
+        <w:t>7. 实测质量-速度工作点：1.09B参数实施例中，满深度读出较原始模型交叉熵改善21%（困惑度309→114），深度8退出加速1.98至2.97倍且交叉熵相对原始模型仅增加4.7%，深度8、12、16分别对应3.0、2.0、1.5倍加速与27%、16%、7%的交叉熵增加，可按部署约束选档。</w:t>
+      </w:r>
+    </w:p>
+    <w:p>
+      <w:pPr>
+        <w:pStyle w:val="Normal"/>
+        <w:spacing w:lineRule="exact" w:line="420"/>
+        <w:jc w:val="left"/>
+        <w:rPr>
+          <w:rFonts w:ascii="宋体" w:hAnsi="宋体" w:eastAsia="宋体" w:cs="宋体"/>
+          <w:b/>
+          <w:b/>
+          <w:sz w:val="28"/>
+          <w:szCs w:val="28"/>
+          <w:lang w:val="en-US" w:eastAsia="zh-CN"/>
+        </w:rPr>
+      </w:pPr>
+      <w:r>
+        <w:rPr>
+          <w:rFonts w:ascii="宋体" w:hAnsi="宋体" w:cs="宋体"/>
+          <w:b/>
+          <w:sz w:val="28"/>
+          <w:szCs w:val="28"/>
+        </w:rPr>
+        <w:t>不列入保护：四头负载均衡损失（US2020/0279150A1等混合专家常规辅助手段）、层内注意力投影专家化（CN118657218A、CN118690782A）、一般两阶段冻结骨干微调早退头（US2026/0148045A1）、常规均匀初始化、比较相邻时间步激活的门控一般形式（US2022/0157045A1）。</w:t>
       </w:r>
     </w:p>
     <w:p>

</xml_diff>